<commit_message>
feat: add presentation deliverables, course component, and update internship reports with pedagogical supervision details
</commit_message>
<xml_diff>
--- a/RAPPORT_DE_STAGE_EMSI.docx
+++ b/RAPPORT_DE_STAGE_EMSI.docx
@@ -388,7 +388,7 @@
           </w:tcPr>
           <w:p>
             <w:pPr>
-              <w:spacing w:after="40" w:before="0" w:line="260"/>
+              <w:spacing w:after="20" w:before="0" w:line="240"/>
               <w:jc w:val="left"/>
             </w:pPr>
             <w:r>
@@ -397,16 +397,16 @@
                 <w:b/>
                 <w:bCs/>
                 <w:color w:val="1A365D"/>
-                <w:sz w:val="22"/>
-                <w:szCs w:val="22"/>
+                <w:sz w:val="20"/>
+                <w:szCs w:val="20"/>
                 <w:u w:val="single"/>
               </w:rPr>
-              <w:t xml:space="preserve">Encadrante Professionnelle :</w:t>
-            </w:r>
-          </w:p>
-          <w:p>
-            <w:pPr>
-              <w:spacing w:after="20" w:before="0" w:line="260"/>
+              <w:t xml:space="preserve">Encadrante Pédagogique :</w:t>
+            </w:r>
+          </w:p>
+          <w:p>
+            <w:pPr>
+              <w:spacing w:after="30" w:before="0" w:line="240"/>
               <w:jc w:val="left"/>
             </w:pPr>
             <w:r>
@@ -415,15 +415,50 @@
                 <w:b/>
                 <w:bCs/>
                 <w:color w:val="B9141A"/>
-                <w:sz w:val="24"/>
-                <w:szCs w:val="24"/>
+                <w:sz w:val="22"/>
+                <w:szCs w:val="22"/>
+              </w:rPr>
+              <w:t xml:space="preserve">Madame Souad ATIGI (EMSI)</w:t>
+            </w:r>
+          </w:p>
+          <w:p>
+            <w:pPr>
+              <w:spacing w:after="20" w:before="0" w:line="240"/>
+              <w:jc w:val="left"/>
+            </w:pPr>
+            <w:r>
+              <w:rPr>
+                <w:rFonts w:ascii="Times New Roman" w:cs="Times New Roman" w:eastAsia="Times New Roman" w:hAnsi="Times New Roman"/>
+                <w:b/>
+                <w:bCs/>
+                <w:color w:val="1A365D"/>
+                <w:sz w:val="20"/>
+                <w:szCs w:val="20"/>
+                <w:u w:val="single"/>
+              </w:rPr>
+              <w:t xml:space="preserve">Encadrante Professionnelle :</w:t>
+            </w:r>
+          </w:p>
+          <w:p>
+            <w:pPr>
+              <w:spacing w:after="20" w:before="0" w:line="240"/>
+              <w:jc w:val="left"/>
+            </w:pPr>
+            <w:r>
+              <w:rPr>
+                <w:rFonts w:ascii="Times New Roman" w:cs="Times New Roman" w:eastAsia="Times New Roman" w:hAnsi="Times New Roman"/>
+                <w:b/>
+                <w:bCs/>
+                <w:color w:val="B9141A"/>
+                <w:sz w:val="22"/>
+                <w:szCs w:val="22"/>
               </w:rPr>
               <w:t xml:space="preserve">Madame Aïcha FADLI</w:t>
             </w:r>
           </w:p>
           <w:p>
             <w:pPr>
-              <w:spacing w:after="120" w:before="0" w:line="240"/>
+              <w:spacing w:after="40" w:before="0" w:line="220"/>
               <w:jc w:val="left"/>
             </w:pPr>
             <w:r>
@@ -432,8 +467,8 @@
                 <w:i/>
                 <w:iCs/>
                 <w:color w:val="444444"/>
-                <w:sz w:val="20"/>
-                <w:szCs w:val="20"/>
+                <w:sz w:val="18"/>
+                <w:szCs w:val="18"/>
               </w:rPr>
               <w:t xml:space="preserve">Responsable Digitale (UQASE NEXT SARL)</w:t>
             </w:r>
@@ -709,7 +744,53 @@
           <w:sz w:val="24"/>
           <w:szCs w:val="24"/>
         </w:rPr>
-        <w:t xml:space="preserve">Nous adressons notre profonde et sincère reconnaissance à notre encadrante professionnelle, </w:t>
+        <w:t xml:space="preserve">Nous adressons notre profonde reconnaissance à notre encadrante pédagogique, </w:t>
+      </w:r>
+      <w:r>
+        <w:rPr>
+          <w:rFonts w:ascii="Times New Roman" w:cs="Times New Roman" w:eastAsia="Times New Roman" w:hAnsi="Times New Roman"/>
+          <w:b/>
+          <w:bCs/>
+          <w:i w:val="false"/>
+          <w:iCs w:val="false"/>
+          <w:color w:val="B9141A"/>
+          <w:sz w:val="24"/>
+          <w:szCs w:val="24"/>
+        </w:rPr>
+        <w:t xml:space="preserve">Madame Souad ATIGI</w:t>
+      </w:r>
+      <w:r>
+        <w:rPr>
+          <w:rFonts w:ascii="Times New Roman" w:cs="Times New Roman" w:eastAsia="Times New Roman" w:hAnsi="Times New Roman"/>
+          <w:b w:val="false"/>
+          <w:bCs w:val="false"/>
+          <w:i w:val="false"/>
+          <w:iCs w:val="false"/>
+          <w:color w:val="222222"/>
+          <w:sz w:val="24"/>
+          <w:szCs w:val="24"/>
+        </w:rPr>
+        <w:t xml:space="preserve">, pour son suivi attentif, sa disponibilité, ses conseils constructifs et ses précieux encouragements tout au long de la réalisation de ce travail.</w:t>
+      </w:r>
+    </w:p>
+    <w:p>
+      <w:pPr>
+        <w:spacing w:after="120" w:before="0" w:line="360" w:lineRule="auto"/>
+        <w:ind w:firstLine="454"/>
+        <w:jc w:val="both"/>
+      </w:pPr>
+      <w:r>
+        <w:rPr>
+          <w:rFonts w:ascii="Times New Roman" w:cs="Times New Roman" w:eastAsia="Times New Roman" w:hAnsi="Times New Roman"/>
+          <w:b w:val="false"/>
+          <w:bCs w:val="false"/>
+          <w:i w:val="false"/>
+          <w:iCs w:val="false"/>
+          <w:color w:val="222222"/>
+          <w:sz w:val="24"/>
+          <w:szCs w:val="24"/>
+        </w:rPr>
+        <w:t xml:space="preserve">Nous exprimons également notre sincère gratitude à notre encadrante professionnelle, </w:t>
       </w:r>
       <w:r>
         <w:rPr>

</xml_diff>